<commit_message>
Add final portfolio URL and social preview
</commit_message>
<xml_diff>
--- a/public/Harsh_Shukla_Resume.docx
+++ b/public/Harsh_Shukla_Resume.docx
@@ -127,6 +127,26 @@
             <w:u w:val="single"/>
           </w:rPr>
           <w:t>GitHub</w:t>
+        </w:r>
+      </w:hyperlink>
+      <w:r>
+        <w:rPr>
+          <w:rFonts w:ascii="Arial" w:hAnsi="Arial"/>
+          <w:b w:val="0"/>
+          <w:color w:val="464646"/>
+          <w:sz w:val="16"/>
+        </w:rPr>
+        <w:t xml:space="preserve">  |  </w:t>
+      </w:r>
+      <w:hyperlink r:id="rId13">
+        <w:r>
+          <w:rPr>
+            <w:rFonts w:ascii="Arial" w:hAnsi="Arial"/>
+            <w:color w:val="17365D"/>
+            <w:sz w:val="16"/>
+            <w:u w:val="single"/>
+          </w:rPr>
+          <w:t>Portfolio</w:t>
         </w:r>
       </w:hyperlink>
     </w:p>
@@ -402,7 +422,7 @@
         </w:rPr>
         <w:t xml:space="preserve">  |  Next.js 16, React 19, TypeScript, Supabase, PostgreSQL, WebRTC, Gemini  |  </w:t>
       </w:r>
-      <w:hyperlink r:id="rId13">
+      <w:hyperlink r:id="rId14">
         <w:r>
           <w:rPr>
             <w:rFonts w:ascii="Arial" w:hAnsi="Arial"/>
@@ -422,7 +442,7 @@
         </w:rPr>
         <w:t xml:space="preserve">  |  </w:t>
       </w:r>
-      <w:hyperlink r:id="rId14">
+      <w:hyperlink r:id="rId15">
         <w:r>
           <w:rPr>
             <w:rFonts w:ascii="Arial" w:hAnsi="Arial"/>
@@ -489,7 +509,7 @@
         </w:rPr>
         <w:t xml:space="preserve">  |  Next.js, TypeScript, Tailwind CSS, Supabase, PostgreSQL, Gemini API  |  </w:t>
       </w:r>
-      <w:hyperlink r:id="rId15">
+      <w:hyperlink r:id="rId16">
         <w:r>
           <w:rPr>
             <w:rFonts w:ascii="Arial" w:hAnsi="Arial"/>
@@ -509,7 +529,7 @@
         </w:rPr>
         <w:t xml:space="preserve">  |  </w:t>
       </w:r>
-      <w:hyperlink r:id="rId16">
+      <w:hyperlink r:id="rId17">
         <w:r>
           <w:rPr>
             <w:rFonts w:ascii="Arial" w:hAnsi="Arial"/>
@@ -576,7 +596,7 @@
         </w:rPr>
         <w:t xml:space="preserve">  |  React, Vite, Three.js, GLSL, GSAP, Framer Motion  |  </w:t>
       </w:r>
-      <w:hyperlink r:id="rId17">
+      <w:hyperlink r:id="rId18">
         <w:r>
           <w:rPr>
             <w:rFonts w:ascii="Arial" w:hAnsi="Arial"/>
@@ -596,7 +616,7 @@
         </w:rPr>
         <w:t xml:space="preserve">  |  </w:t>
       </w:r>
-      <w:hyperlink r:id="rId18">
+      <w:hyperlink r:id="rId19">
         <w:r>
           <w:rPr>
             <w:rFonts w:ascii="Arial" w:hAnsi="Arial"/>
@@ -647,7 +667,7 @@
         </w:rPr>
         <w:t xml:space="preserve">  |  React, Vite, Three.js, React Three Fiber, GSAP, Web Audio API  |  </w:t>
       </w:r>
-      <w:hyperlink r:id="rId19">
+      <w:hyperlink r:id="rId20">
         <w:r>
           <w:rPr>
             <w:rFonts w:ascii="Arial" w:hAnsi="Arial"/>
@@ -667,7 +687,7 @@
         </w:rPr>
         <w:t xml:space="preserve">  |  </w:t>
       </w:r>
-      <w:hyperlink r:id="rId20">
+      <w:hyperlink r:id="rId21">
         <w:r>
           <w:rPr>
             <w:rFonts w:ascii="Arial" w:hAnsi="Arial"/>
@@ -718,7 +738,7 @@
         </w:rPr>
         <w:t xml:space="preserve">  |  React, Vite, Tailwind CSS, Three.js, React Three Fiber, GSAP, REST APIs  |  </w:t>
       </w:r>
-      <w:hyperlink r:id="rId21">
+      <w:hyperlink r:id="rId22">
         <w:r>
           <w:rPr>
             <w:rFonts w:ascii="Arial" w:hAnsi="Arial"/>
@@ -738,7 +758,7 @@
         </w:rPr>
         <w:t xml:space="preserve">  |  </w:t>
       </w:r>
-      <w:hyperlink r:id="rId22">
+      <w:hyperlink r:id="rId23">
         <w:r>
           <w:rPr>
             <w:rFonts w:ascii="Arial" w:hAnsi="Arial"/>
@@ -789,7 +809,7 @@
         </w:rPr>
         <w:t xml:space="preserve">  |  React, Vite, Three.js, React Three Fiber, GSAP, ScrollTrigger, Lenis  |  </w:t>
       </w:r>
-      <w:hyperlink r:id="rId23">
+      <w:hyperlink r:id="rId24">
         <w:r>
           <w:rPr>
             <w:rFonts w:ascii="Arial" w:hAnsi="Arial"/>
@@ -809,7 +829,7 @@
         </w:rPr>
         <w:t xml:space="preserve">  |  </w:t>
       </w:r>
-      <w:hyperlink r:id="rId24">
+      <w:hyperlink r:id="rId25">
         <w:r>
           <w:rPr>
             <w:rFonts w:ascii="Arial" w:hAnsi="Arial"/>
@@ -875,7 +895,7 @@
         </w:rPr>
         <w:t xml:space="preserve">  |  MongoDB, Inc.  |  Sep 2026  |  </w:t>
       </w:r>
-      <w:hyperlink r:id="rId25">
+      <w:hyperlink r:id="rId26">
         <w:r>
           <w:rPr>
             <w:rFonts w:ascii="Arial" w:hAnsi="Arial"/>

</xml_diff>